<commit_message>
Push docx tables to site
</commit_message>
<xml_diff>
--- a/tables/PSA_tables_costs.docx
+++ b/tables/PSA_tables_costs.docx
@@ -296,7 +296,7 @@
                 <w:rFonts w:ascii="Calibri" w:hAnsi="Calibri"/>
                 <w:sz w:val="20"/>
               </w:rPr>
-              <w:t xml:space="default">2.001744</w:t>
+              <w:t xml:space="default">2.001759</w:t>
             </w:r>
           </w:p>
         </w:tc>
@@ -469,7 +469,7 @@
                 <w:rFonts w:ascii="Calibri" w:hAnsi="Calibri"/>
                 <w:sz w:val="20"/>
               </w:rPr>
-              <w:t xml:space="default">110875.799260</w:t>
+              <w:t xml:space="default">110936.094113</w:t>
             </w:r>
           </w:p>
         </w:tc>
@@ -642,7 +642,7 @@
                 <w:rFonts w:ascii="Calibri" w:hAnsi="Calibri"/>
                 <w:sz w:val="20"/>
               </w:rPr>
-              <w:t xml:space="default">6660.002545</w:t>
+              <w:t xml:space="default">6659.063234</w:t>
             </w:r>
           </w:p>
         </w:tc>
@@ -1220,7 +1220,11 @@
         <w:pStyle w:val="FirstParagraph"/>
       </w:pPr>
     </w:p>
-    <w:sectPr/>
+    <w:sectPr>
+      <w:footnotePr>
+        <w:numRestart w:val="eachSect"/>
+      </w:footnotePr>
+    </w:sectPr>
   </w:body>
 </w:document>
 </file>
@@ -1337,10 +1341,10 @@
   <w:docDefaults>
     <w:rPrDefault>
       <w:rPr>
-        <w:rFonts w:asciiTheme="minorHAnsi" w:cstheme="minorBidi" w:eastAsiaTheme="minorHAnsi" w:hAnsiTheme="minorHAnsi"/>
+        <w:rFonts w:asciiTheme="minorHAnsi" w:cstheme="minorBidi" w:eastAsiaTheme="minorEastAsia" w:hAnsiTheme="minorHAnsi"/>
         <w:sz w:val="24"/>
         <w:szCs w:val="24"/>
-        <w:lang w:bidi="ar-SA" w:eastAsia="en-US" w:val="en-US"/>
+        <w:lang w:bidi="ar-SA" w:eastAsia="zh-CN" w:val="en-US"/>
       </w:rPr>
     </w:rPrDefault>
     <w:pPrDefault>
@@ -1392,8 +1396,6 @@
     </w:pPr>
     <w:rPr>
       <w:rFonts w:asciiTheme="majorHAnsi" w:cstheme="majorBidi" w:eastAsiaTheme="majorEastAsia" w:hAnsiTheme="majorHAnsi"/>
-      <w:spacing w:val="-10"/>
-      <w:kern w:val="28"/>
       <w:sz w:val="56"/>
       <w:szCs w:val="56"/>
     </w:rPr>
@@ -1406,8 +1408,6 @@
     <w:rsid w:val="00A10FD9"/>
     <w:rPr>
       <w:rFonts w:asciiTheme="majorHAnsi" w:cstheme="majorBidi" w:eastAsiaTheme="majorEastAsia" w:hAnsiTheme="majorHAnsi"/>
-      <w:spacing w:val="-10"/>
-      <w:kern w:val="28"/>
       <w:sz w:val="56"/>
       <w:szCs w:val="56"/>
     </w:rPr>
@@ -1448,23 +1448,31 @@
   </w:style>
   <w:style w:customStyle="1" w:styleId="Author" w:type="paragraph">
     <w:name w:val="Author"/>
+    <w:basedOn w:val="Title"/>
     <w:next w:val="BodyText"/>
     <w:qFormat/>
     <w:pPr>
       <w:keepNext/>
       <w:keepLines/>
-      <w:jc w:val="center"/>
     </w:pPr>
+    <w:rPr>
+      <w:sz w:val="24"/>
+      <w:szCs w:val="24"/>
+    </w:rPr>
   </w:style>
   <w:style w:styleId="Date" w:type="paragraph">
     <w:name w:val="Date"/>
+    <w:basedOn w:val="Title"/>
     <w:next w:val="BodyText"/>
     <w:qFormat/>
     <w:pPr>
       <w:keepNext/>
       <w:keepLines/>
-      <w:jc w:val="center"/>
     </w:pPr>
+    <w:rPr>
+      <w:sz w:val="24"/>
+      <w:szCs w:val="24"/>
+    </w:rPr>
   </w:style>
   <w:style w:customStyle="1" w:styleId="AbstractTitle" w:type="paragraph">
     <w:name w:val="Abstract Title"/>
@@ -1877,13 +1885,6 @@
       </w:tblCellMar>
     </w:tblPr>
     <w:tblStylePr w:type="firstRow">
-      <w:tblPr>
-        <w:jc w:val="left"/>
-        <w:tblInd w:type="dxa" w:w="0"/>
-      </w:tblPr>
-      <w:trPr>
-        <w:jc w:val="left"/>
-      </w:trPr>
       <w:tcPr>
         <w:tcBorders>
           <w:bottom w:val="single"/>

</xml_diff>